<commit_message>
Reporte en Word: margen normal dentro de las celdas de las tablas
Co-Authored-By: Claude Opus 5.5 <noreply@anthropic.com>
Claude-Session: https://claude.ai/code/session_015RxpEn8K29UwfJdvrbtemn
</commit_message>
<xml_diff>
--- a/proyecto_mongodb_logistica/docs/Reporte_Proyecto_NoSQL.docx
+++ b/proyecto_mongodb_logistica/docs/Reporte_Proyecto_NoSQL.docx
@@ -679,6 +679,10 @@
               <w:bottom w:val="single" w:color="000000" w:sz="4"/>
               <w:right w:val="single" w:color="000000" w:sz="4"/>
             </w:tcBorders>
+            <w:tcMar>
+              <w:left w:type="dxa" w:w="108"/>
+              <w:right w:type="dxa" w:w="108"/>
+            </w:tcMar>
           </w:tcPr>
           <w:p>
             <w:pPr>
@@ -702,6 +706,10 @@
               <w:bottom w:val="single" w:color="000000" w:sz="4"/>
               <w:right w:val="single" w:color="000000" w:sz="4"/>
             </w:tcBorders>
+            <w:tcMar>
+              <w:left w:type="dxa" w:w="108"/>
+              <w:right w:type="dxa" w:w="108"/>
+            </w:tcMar>
           </w:tcPr>
           <w:p>
             <w:pPr>
@@ -725,6 +733,10 @@
               <w:bottom w:val="single" w:color="000000" w:sz="4"/>
               <w:right w:val="single" w:color="000000" w:sz="4"/>
             </w:tcBorders>
+            <w:tcMar>
+              <w:left w:type="dxa" w:w="108"/>
+              <w:right w:type="dxa" w:w="108"/>
+            </w:tcMar>
           </w:tcPr>
           <w:p>
             <w:pPr>
@@ -753,6 +765,10 @@
               <w:bottom w:val="single" w:color="000000" w:sz="4"/>
               <w:right w:val="single" w:color="000000" w:sz="4"/>
             </w:tcBorders>
+            <w:tcMar>
+              <w:left w:type="dxa" w:w="108"/>
+              <w:right w:type="dxa" w:w="108"/>
+            </w:tcMar>
           </w:tcPr>
           <w:p>
             <w:pPr>
@@ -772,6 +788,10 @@
               <w:bottom w:val="single" w:color="000000" w:sz="4"/>
               <w:right w:val="single" w:color="000000" w:sz="4"/>
             </w:tcBorders>
+            <w:tcMar>
+              <w:left w:type="dxa" w:w="108"/>
+              <w:right w:type="dxa" w:w="108"/>
+            </w:tcMar>
           </w:tcPr>
           <w:p>
             <w:pPr>
@@ -799,6 +819,10 @@
               <w:bottom w:val="single" w:color="000000" w:sz="4"/>
               <w:right w:val="single" w:color="000000" w:sz="4"/>
             </w:tcBorders>
+            <w:tcMar>
+              <w:left w:type="dxa" w:w="108"/>
+              <w:right w:type="dxa" w:w="108"/>
+            </w:tcMar>
           </w:tcPr>
           <w:p>
             <w:pPr>
@@ -842,6 +866,10 @@
               <w:bottom w:val="single" w:color="000000" w:sz="4"/>
               <w:right w:val="single" w:color="000000" w:sz="4"/>
             </w:tcBorders>
+            <w:tcMar>
+              <w:left w:type="dxa" w:w="108"/>
+              <w:right w:type="dxa" w:w="108"/>
+            </w:tcMar>
           </w:tcPr>
           <w:p>
             <w:pPr>
@@ -861,6 +889,10 @@
               <w:bottom w:val="single" w:color="000000" w:sz="4"/>
               <w:right w:val="single" w:color="000000" w:sz="4"/>
             </w:tcBorders>
+            <w:tcMar>
+              <w:left w:type="dxa" w:w="108"/>
+              <w:right w:type="dxa" w:w="108"/>
+            </w:tcMar>
           </w:tcPr>
           <w:p>
             <w:pPr>
@@ -880,6 +912,10 @@
               <w:bottom w:val="single" w:color="000000" w:sz="4"/>
               <w:right w:val="single" w:color="000000" w:sz="4"/>
             </w:tcBorders>
+            <w:tcMar>
+              <w:left w:type="dxa" w:w="108"/>
+              <w:right w:type="dxa" w:w="108"/>
+            </w:tcMar>
           </w:tcPr>
           <w:p>
             <w:pPr>
@@ -931,6 +967,10 @@
               <w:bottom w:val="single" w:color="000000" w:sz="4"/>
               <w:right w:val="single" w:color="000000" w:sz="4"/>
             </w:tcBorders>
+            <w:tcMar>
+              <w:left w:type="dxa" w:w="108"/>
+              <w:right w:type="dxa" w:w="108"/>
+            </w:tcMar>
           </w:tcPr>
           <w:p>
             <w:pPr>
@@ -950,6 +990,10 @@
               <w:bottom w:val="single" w:color="000000" w:sz="4"/>
               <w:right w:val="single" w:color="000000" w:sz="4"/>
             </w:tcBorders>
+            <w:tcMar>
+              <w:left w:type="dxa" w:w="108"/>
+              <w:right w:type="dxa" w:w="108"/>
+            </w:tcMar>
           </w:tcPr>
           <w:p>
             <w:pPr>
@@ -969,6 +1013,10 @@
               <w:bottom w:val="single" w:color="000000" w:sz="4"/>
               <w:right w:val="single" w:color="000000" w:sz="4"/>
             </w:tcBorders>
+            <w:tcMar>
+              <w:left w:type="dxa" w:w="108"/>
+              <w:right w:type="dxa" w:w="108"/>
+            </w:tcMar>
           </w:tcPr>
           <w:p>
             <w:pPr>
@@ -1047,6 +1095,10 @@
               <w:bottom w:val="single" w:color="000000" w:sz="4"/>
               <w:right w:val="single" w:color="000000" w:sz="4"/>
             </w:tcBorders>
+            <w:tcMar>
+              <w:left w:type="dxa" w:w="108"/>
+              <w:right w:type="dxa" w:w="108"/>
+            </w:tcMar>
           </w:tcPr>
           <w:p>
             <w:pPr>
@@ -1070,6 +1122,10 @@
               <w:bottom w:val="single" w:color="000000" w:sz="4"/>
               <w:right w:val="single" w:color="000000" w:sz="4"/>
             </w:tcBorders>
+            <w:tcMar>
+              <w:left w:type="dxa" w:w="108"/>
+              <w:right w:type="dxa" w:w="108"/>
+            </w:tcMar>
           </w:tcPr>
           <w:p>
             <w:pPr>
@@ -1098,6 +1154,10 @@
               <w:bottom w:val="single" w:color="000000" w:sz="4"/>
               <w:right w:val="single" w:color="000000" w:sz="4"/>
             </w:tcBorders>
+            <w:tcMar>
+              <w:left w:type="dxa" w:w="108"/>
+              <w:right w:type="dxa" w:w="108"/>
+            </w:tcMar>
           </w:tcPr>
           <w:p>
             <w:pPr>
@@ -1122,6 +1182,10 @@
               <w:bottom w:val="single" w:color="000000" w:sz="4"/>
               <w:right w:val="single" w:color="000000" w:sz="4"/>
             </w:tcBorders>
+            <w:tcMar>
+              <w:left w:type="dxa" w:w="108"/>
+              <w:right w:type="dxa" w:w="108"/>
+            </w:tcMar>
           </w:tcPr>
           <w:p>
             <w:pPr>
@@ -1157,6 +1221,10 @@
               <w:bottom w:val="single" w:color="000000" w:sz="4"/>
               <w:right w:val="single" w:color="000000" w:sz="4"/>
             </w:tcBorders>
+            <w:tcMar>
+              <w:left w:type="dxa" w:w="108"/>
+              <w:right w:type="dxa" w:w="108"/>
+            </w:tcMar>
           </w:tcPr>
           <w:p>
             <w:pPr>
@@ -1181,6 +1249,10 @@
               <w:bottom w:val="single" w:color="000000" w:sz="4"/>
               <w:right w:val="single" w:color="000000" w:sz="4"/>
             </w:tcBorders>
+            <w:tcMar>
+              <w:left w:type="dxa" w:w="108"/>
+              <w:right w:type="dxa" w:w="108"/>
+            </w:tcMar>
           </w:tcPr>
           <w:p>
             <w:pPr>
@@ -1216,6 +1288,10 @@
               <w:bottom w:val="single" w:color="000000" w:sz="4"/>
               <w:right w:val="single" w:color="000000" w:sz="4"/>
             </w:tcBorders>
+            <w:tcMar>
+              <w:left w:type="dxa" w:w="108"/>
+              <w:right w:type="dxa" w:w="108"/>
+            </w:tcMar>
           </w:tcPr>
           <w:p>
             <w:pPr>
@@ -1240,6 +1316,10 @@
               <w:bottom w:val="single" w:color="000000" w:sz="4"/>
               <w:right w:val="single" w:color="000000" w:sz="4"/>
             </w:tcBorders>
+            <w:tcMar>
+              <w:left w:type="dxa" w:w="108"/>
+              <w:right w:type="dxa" w:w="108"/>
+            </w:tcMar>
           </w:tcPr>
           <w:p>
             <w:pPr>
@@ -1264,6 +1344,10 @@
               <w:bottom w:val="single" w:color="000000" w:sz="4"/>
               <w:right w:val="single" w:color="000000" w:sz="4"/>
             </w:tcBorders>
+            <w:tcMar>
+              <w:left w:type="dxa" w:w="108"/>
+              <w:right w:type="dxa" w:w="108"/>
+            </w:tcMar>
           </w:tcPr>
           <w:p>
             <w:pPr>
@@ -1288,6 +1372,10 @@
               <w:bottom w:val="single" w:color="000000" w:sz="4"/>
               <w:right w:val="single" w:color="000000" w:sz="4"/>
             </w:tcBorders>
+            <w:tcMar>
+              <w:left w:type="dxa" w:w="108"/>
+              <w:right w:type="dxa" w:w="108"/>
+            </w:tcMar>
           </w:tcPr>
           <w:p>
             <w:pPr>
@@ -1312,6 +1400,10 @@
               <w:bottom w:val="single" w:color="000000" w:sz="4"/>
               <w:right w:val="single" w:color="000000" w:sz="4"/>
             </w:tcBorders>
+            <w:tcMar>
+              <w:left w:type="dxa" w:w="108"/>
+              <w:right w:type="dxa" w:w="108"/>
+            </w:tcMar>
           </w:tcPr>
           <w:p>
             <w:pPr>
@@ -1336,6 +1428,10 @@
               <w:bottom w:val="single" w:color="000000" w:sz="4"/>
               <w:right w:val="single" w:color="000000" w:sz="4"/>
             </w:tcBorders>
+            <w:tcMar>
+              <w:left w:type="dxa" w:w="108"/>
+              <w:right w:type="dxa" w:w="108"/>
+            </w:tcMar>
           </w:tcPr>
           <w:p>
             <w:pPr>
@@ -1722,6 +1818,10 @@
               <w:bottom w:val="single" w:color="000000" w:sz="4"/>
               <w:right w:val="single" w:color="000000" w:sz="4"/>
             </w:tcBorders>
+            <w:tcMar>
+              <w:left w:type="dxa" w:w="108"/>
+              <w:right w:type="dxa" w:w="108"/>
+            </w:tcMar>
           </w:tcPr>
           <w:p>
             <w:pPr>
@@ -1745,6 +1845,10 @@
               <w:bottom w:val="single" w:color="000000" w:sz="4"/>
               <w:right w:val="single" w:color="000000" w:sz="4"/>
             </w:tcBorders>
+            <w:tcMar>
+              <w:left w:type="dxa" w:w="108"/>
+              <w:right w:type="dxa" w:w="108"/>
+            </w:tcMar>
           </w:tcPr>
           <w:p>
             <w:pPr>
@@ -1773,6 +1877,10 @@
               <w:bottom w:val="single" w:color="000000" w:sz="4"/>
               <w:right w:val="single" w:color="000000" w:sz="4"/>
             </w:tcBorders>
+            <w:tcMar>
+              <w:left w:type="dxa" w:w="108"/>
+              <w:right w:type="dxa" w:w="108"/>
+            </w:tcMar>
           </w:tcPr>
           <w:p>
             <w:pPr>
@@ -1792,6 +1900,10 @@
               <w:bottom w:val="single" w:color="000000" w:sz="4"/>
               <w:right w:val="single" w:color="000000" w:sz="4"/>
             </w:tcBorders>
+            <w:tcMar>
+              <w:left w:type="dxa" w:w="108"/>
+              <w:right w:type="dxa" w:w="108"/>
+            </w:tcMar>
           </w:tcPr>
           <w:p>
             <w:pPr>
@@ -1876,6 +1988,10 @@
               <w:bottom w:val="single" w:color="000000" w:sz="4"/>
               <w:right w:val="single" w:color="000000" w:sz="4"/>
             </w:tcBorders>
+            <w:tcMar>
+              <w:left w:type="dxa" w:w="108"/>
+              <w:right w:type="dxa" w:w="108"/>
+            </w:tcMar>
           </w:tcPr>
           <w:p>
             <w:pPr>
@@ -1895,6 +2011,10 @@
               <w:bottom w:val="single" w:color="000000" w:sz="4"/>
               <w:right w:val="single" w:color="000000" w:sz="4"/>
             </w:tcBorders>
+            <w:tcMar>
+              <w:left w:type="dxa" w:w="108"/>
+              <w:right w:type="dxa" w:w="108"/>
+            </w:tcMar>
           </w:tcPr>
           <w:p>
             <w:pPr>
@@ -1946,6 +2066,10 @@
               <w:bottom w:val="single" w:color="000000" w:sz="4"/>
               <w:right w:val="single" w:color="000000" w:sz="4"/>
             </w:tcBorders>
+            <w:tcMar>
+              <w:left w:type="dxa" w:w="108"/>
+              <w:right w:type="dxa" w:w="108"/>
+            </w:tcMar>
           </w:tcPr>
           <w:p>
             <w:pPr>
@@ -1965,6 +2089,10 @@
               <w:bottom w:val="single" w:color="000000" w:sz="4"/>
               <w:right w:val="single" w:color="000000" w:sz="4"/>
             </w:tcBorders>
+            <w:tcMar>
+              <w:left w:type="dxa" w:w="108"/>
+              <w:right w:type="dxa" w:w="108"/>
+            </w:tcMar>
           </w:tcPr>
           <w:p>
             <w:pPr>
@@ -1994,6 +2122,10 @@
               <w:bottom w:val="single" w:color="000000" w:sz="4"/>
               <w:right w:val="single" w:color="000000" w:sz="4"/>
             </w:tcBorders>
+            <w:tcMar>
+              <w:left w:type="dxa" w:w="108"/>
+              <w:right w:type="dxa" w:w="108"/>
+            </w:tcMar>
           </w:tcPr>
           <w:p>
             <w:pPr>
@@ -2013,6 +2145,10 @@
               <w:bottom w:val="single" w:color="000000" w:sz="4"/>
               <w:right w:val="single" w:color="000000" w:sz="4"/>
             </w:tcBorders>
+            <w:tcMar>
+              <w:left w:type="dxa" w:w="108"/>
+              <w:right w:type="dxa" w:w="108"/>
+            </w:tcMar>
           </w:tcPr>
           <w:p>
             <w:pPr>
@@ -2765,6 +2901,10 @@
               <w:bottom w:val="single" w:color="000000" w:sz="4"/>
               <w:right w:val="single" w:color="000000" w:sz="4"/>
             </w:tcBorders>
+            <w:tcMar>
+              <w:left w:type="dxa" w:w="108"/>
+              <w:right w:type="dxa" w:w="108"/>
+            </w:tcMar>
           </w:tcPr>
           <w:p>
             <w:pPr>
@@ -2788,6 +2928,10 @@
               <w:bottom w:val="single" w:color="000000" w:sz="4"/>
               <w:right w:val="single" w:color="000000" w:sz="4"/>
             </w:tcBorders>
+            <w:tcMar>
+              <w:left w:type="dxa" w:w="108"/>
+              <w:right w:type="dxa" w:w="108"/>
+            </w:tcMar>
           </w:tcPr>
           <w:p>
             <w:pPr>
@@ -2811,6 +2955,10 @@
               <w:bottom w:val="single" w:color="000000" w:sz="4"/>
               <w:right w:val="single" w:color="000000" w:sz="4"/>
             </w:tcBorders>
+            <w:tcMar>
+              <w:left w:type="dxa" w:w="108"/>
+              <w:right w:type="dxa" w:w="108"/>
+            </w:tcMar>
           </w:tcPr>
           <w:p>
             <w:pPr>
@@ -2834,6 +2982,10 @@
               <w:bottom w:val="single" w:color="000000" w:sz="4"/>
               <w:right w:val="single" w:color="000000" w:sz="4"/>
             </w:tcBorders>
+            <w:tcMar>
+              <w:left w:type="dxa" w:w="108"/>
+              <w:right w:type="dxa" w:w="108"/>
+            </w:tcMar>
           </w:tcPr>
           <w:p>
             <w:pPr>
@@ -2862,6 +3014,10 @@
               <w:bottom w:val="single" w:color="000000" w:sz="4"/>
               <w:right w:val="single" w:color="000000" w:sz="4"/>
             </w:tcBorders>
+            <w:tcMar>
+              <w:left w:type="dxa" w:w="108"/>
+              <w:right w:type="dxa" w:w="108"/>
+            </w:tcMar>
           </w:tcPr>
           <w:p>
             <w:pPr>
@@ -2886,6 +3042,10 @@
               <w:bottom w:val="single" w:color="000000" w:sz="4"/>
               <w:right w:val="single" w:color="000000" w:sz="4"/>
             </w:tcBorders>
+            <w:tcMar>
+              <w:left w:type="dxa" w:w="108"/>
+              <w:right w:type="dxa" w:w="108"/>
+            </w:tcMar>
           </w:tcPr>
           <w:p>
             <w:pPr>
@@ -2912,6 +3072,10 @@
               <w:bottom w:val="single" w:color="000000" w:sz="4"/>
               <w:right w:val="single" w:color="000000" w:sz="4"/>
             </w:tcBorders>
+            <w:tcMar>
+              <w:left w:type="dxa" w:w="108"/>
+              <w:right w:type="dxa" w:w="108"/>
+            </w:tcMar>
           </w:tcPr>
           <w:p>
             <w:pPr>
@@ -2936,6 +3100,10 @@
               <w:bottom w:val="single" w:color="000000" w:sz="4"/>
               <w:right w:val="single" w:color="000000" w:sz="4"/>
             </w:tcBorders>
+            <w:tcMar>
+              <w:left w:type="dxa" w:w="108"/>
+              <w:right w:type="dxa" w:w="108"/>
+            </w:tcMar>
           </w:tcPr>
           <w:p>
             <w:pPr>
@@ -2960,6 +3128,10 @@
               <w:bottom w:val="single" w:color="000000" w:sz="4"/>
               <w:right w:val="single" w:color="000000" w:sz="4"/>
             </w:tcBorders>
+            <w:tcMar>
+              <w:left w:type="dxa" w:w="108"/>
+              <w:right w:type="dxa" w:w="108"/>
+            </w:tcMar>
           </w:tcPr>
           <w:p>
             <w:pPr>
@@ -2984,6 +3156,10 @@
               <w:bottom w:val="single" w:color="000000" w:sz="4"/>
               <w:right w:val="single" w:color="000000" w:sz="4"/>
             </w:tcBorders>
+            <w:tcMar>
+              <w:left w:type="dxa" w:w="108"/>
+              <w:right w:type="dxa" w:w="108"/>
+            </w:tcMar>
           </w:tcPr>
           <w:p>
             <w:pPr>
@@ -3040,6 +3216,10 @@
               <w:bottom w:val="single" w:color="000000" w:sz="4"/>
               <w:right w:val="single" w:color="000000" w:sz="4"/>
             </w:tcBorders>
+            <w:tcMar>
+              <w:left w:type="dxa" w:w="108"/>
+              <w:right w:type="dxa" w:w="108"/>
+            </w:tcMar>
           </w:tcPr>
           <w:p>
             <w:pPr>
@@ -3067,6 +3247,10 @@
               <w:bottom w:val="single" w:color="000000" w:sz="4"/>
               <w:right w:val="single" w:color="000000" w:sz="4"/>
             </w:tcBorders>
+            <w:tcMar>
+              <w:left w:type="dxa" w:w="108"/>
+              <w:right w:type="dxa" w:w="108"/>
+            </w:tcMar>
           </w:tcPr>
           <w:p>
             <w:pPr>
@@ -3129,6 +3313,10 @@
               <w:bottom w:val="single" w:color="000000" w:sz="4"/>
               <w:right w:val="single" w:color="000000" w:sz="4"/>
             </w:tcBorders>
+            <w:tcMar>
+              <w:left w:type="dxa" w:w="108"/>
+              <w:right w:type="dxa" w:w="108"/>
+            </w:tcMar>
           </w:tcPr>
           <w:p>
             <w:pPr>
@@ -3153,6 +3341,10 @@
               <w:bottom w:val="single" w:color="000000" w:sz="4"/>
               <w:right w:val="single" w:color="000000" w:sz="4"/>
             </w:tcBorders>
+            <w:tcMar>
+              <w:left w:type="dxa" w:w="108"/>
+              <w:right w:type="dxa" w:w="108"/>
+            </w:tcMar>
           </w:tcPr>
           <w:p>
             <w:pPr>
@@ -3179,6 +3371,10 @@
               <w:bottom w:val="single" w:color="000000" w:sz="4"/>
               <w:right w:val="single" w:color="000000" w:sz="4"/>
             </w:tcBorders>
+            <w:tcMar>
+              <w:left w:type="dxa" w:w="108"/>
+              <w:right w:type="dxa" w:w="108"/>
+            </w:tcMar>
           </w:tcPr>
           <w:p>
             <w:pPr>
@@ -3206,6 +3402,10 @@
               <w:bottom w:val="single" w:color="000000" w:sz="4"/>
               <w:right w:val="single" w:color="000000" w:sz="4"/>
             </w:tcBorders>
+            <w:tcMar>
+              <w:left w:type="dxa" w:w="108"/>
+              <w:right w:type="dxa" w:w="108"/>
+            </w:tcMar>
           </w:tcPr>
           <w:p>
             <w:pPr>
@@ -3230,6 +3430,10 @@
               <w:bottom w:val="single" w:color="000000" w:sz="4"/>
               <w:right w:val="single" w:color="000000" w:sz="4"/>
             </w:tcBorders>
+            <w:tcMar>
+              <w:left w:type="dxa" w:w="108"/>
+              <w:right w:type="dxa" w:w="108"/>
+            </w:tcMar>
           </w:tcPr>
           <w:p>
             <w:pPr>
@@ -3254,6 +3458,10 @@
               <w:bottom w:val="single" w:color="000000" w:sz="4"/>
               <w:right w:val="single" w:color="000000" w:sz="4"/>
             </w:tcBorders>
+            <w:tcMar>
+              <w:left w:type="dxa" w:w="108"/>
+              <w:right w:type="dxa" w:w="108"/>
+            </w:tcMar>
           </w:tcPr>
           <w:p>
             <w:pPr>
@@ -3273,6 +3481,10 @@
               <w:bottom w:val="single" w:color="000000" w:sz="4"/>
               <w:right w:val="single" w:color="000000" w:sz="4"/>
             </w:tcBorders>
+            <w:tcMar>
+              <w:left w:type="dxa" w:w="108"/>
+              <w:right w:type="dxa" w:w="108"/>
+            </w:tcMar>
           </w:tcPr>
           <w:p>
             <w:pPr>
@@ -3297,6 +3509,10 @@
               <w:bottom w:val="single" w:color="000000" w:sz="4"/>
               <w:right w:val="single" w:color="000000" w:sz="4"/>
             </w:tcBorders>
+            <w:tcMar>
+              <w:left w:type="dxa" w:w="108"/>
+              <w:right w:type="dxa" w:w="108"/>
+            </w:tcMar>
           </w:tcPr>
           <w:p>
             <w:pPr>
@@ -3321,6 +3537,10 @@
               <w:bottom w:val="single" w:color="000000" w:sz="4"/>
               <w:right w:val="single" w:color="000000" w:sz="4"/>
             </w:tcBorders>
+            <w:tcMar>
+              <w:left w:type="dxa" w:w="108"/>
+              <w:right w:type="dxa" w:w="108"/>
+            </w:tcMar>
           </w:tcPr>
           <w:p>
             <w:pPr>
@@ -3345,6 +3565,10 @@
               <w:bottom w:val="single" w:color="000000" w:sz="4"/>
               <w:right w:val="single" w:color="000000" w:sz="4"/>
             </w:tcBorders>
+            <w:tcMar>
+              <w:left w:type="dxa" w:w="108"/>
+              <w:right w:type="dxa" w:w="108"/>
+            </w:tcMar>
           </w:tcPr>
           <w:p>
             <w:pPr>
@@ -3371,6 +3595,10 @@
               <w:bottom w:val="single" w:color="000000" w:sz="4"/>
               <w:right w:val="single" w:color="000000" w:sz="4"/>
             </w:tcBorders>
+            <w:tcMar>
+              <w:left w:type="dxa" w:w="108"/>
+              <w:right w:type="dxa" w:w="108"/>
+            </w:tcMar>
           </w:tcPr>
           <w:p>
             <w:pPr>
@@ -3395,6 +3623,10 @@
               <w:bottom w:val="single" w:color="000000" w:sz="4"/>
               <w:right w:val="single" w:color="000000" w:sz="4"/>
             </w:tcBorders>
+            <w:tcMar>
+              <w:left w:type="dxa" w:w="108"/>
+              <w:right w:type="dxa" w:w="108"/>
+            </w:tcMar>
           </w:tcPr>
           <w:p>
             <w:pPr>
@@ -3424,6 +3656,10 @@
               <w:bottom w:val="single" w:color="000000" w:sz="4"/>
               <w:right w:val="single" w:color="000000" w:sz="4"/>
             </w:tcBorders>
+            <w:tcMar>
+              <w:left w:type="dxa" w:w="108"/>
+              <w:right w:type="dxa" w:w="108"/>
+            </w:tcMar>
           </w:tcPr>
           <w:p>
             <w:pPr>
@@ -3448,6 +3684,10 @@
               <w:bottom w:val="single" w:color="000000" w:sz="4"/>
               <w:right w:val="single" w:color="000000" w:sz="4"/>
             </w:tcBorders>
+            <w:tcMar>
+              <w:left w:type="dxa" w:w="108"/>
+              <w:right w:type="dxa" w:w="108"/>
+            </w:tcMar>
           </w:tcPr>
           <w:p>
             <w:pPr>
@@ -3474,6 +3714,10 @@
               <w:bottom w:val="single" w:color="000000" w:sz="4"/>
               <w:right w:val="single" w:color="000000" w:sz="4"/>
             </w:tcBorders>
+            <w:tcMar>
+              <w:left w:type="dxa" w:w="108"/>
+              <w:right w:type="dxa" w:w="108"/>
+            </w:tcMar>
           </w:tcPr>
           <w:p>
             <w:pPr>
@@ -3498,6 +3742,10 @@
               <w:bottom w:val="single" w:color="000000" w:sz="4"/>
               <w:right w:val="single" w:color="000000" w:sz="4"/>
             </w:tcBorders>
+            <w:tcMar>
+              <w:left w:type="dxa" w:w="108"/>
+              <w:right w:type="dxa" w:w="108"/>
+            </w:tcMar>
           </w:tcPr>
           <w:p>
             <w:pPr>
@@ -3560,6 +3808,10 @@
               <w:bottom w:val="single" w:color="000000" w:sz="4"/>
               <w:right w:val="single" w:color="000000" w:sz="4"/>
             </w:tcBorders>
+            <w:tcMar>
+              <w:left w:type="dxa" w:w="108"/>
+              <w:right w:type="dxa" w:w="108"/>
+            </w:tcMar>
           </w:tcPr>
           <w:p>
             <w:pPr>
@@ -3584,6 +3836,10 @@
               <w:bottom w:val="single" w:color="000000" w:sz="4"/>
               <w:right w:val="single" w:color="000000" w:sz="4"/>
             </w:tcBorders>
+            <w:tcMar>
+              <w:left w:type="dxa" w:w="108"/>
+              <w:right w:type="dxa" w:w="108"/>
+            </w:tcMar>
           </w:tcPr>
           <w:p>
             <w:pPr>
@@ -3617,6 +3873,10 @@
               <w:bottom w:val="single" w:color="000000" w:sz="4"/>
               <w:right w:val="single" w:color="000000" w:sz="4"/>
             </w:tcBorders>
+            <w:tcMar>
+              <w:left w:type="dxa" w:w="108"/>
+              <w:right w:type="dxa" w:w="108"/>
+            </w:tcMar>
           </w:tcPr>
           <w:p>
             <w:pPr>
@@ -3641,6 +3901,10 @@
               <w:bottom w:val="single" w:color="000000" w:sz="4"/>
               <w:right w:val="single" w:color="000000" w:sz="4"/>
             </w:tcBorders>
+            <w:tcMar>
+              <w:left w:type="dxa" w:w="108"/>
+              <w:right w:type="dxa" w:w="108"/>
+            </w:tcMar>
           </w:tcPr>
           <w:p>
             <w:pPr>
@@ -3745,6 +4009,10 @@
               <w:bottom w:val="single" w:color="000000" w:sz="4"/>
               <w:right w:val="single" w:color="000000" w:sz="4"/>
             </w:tcBorders>
+            <w:tcMar>
+              <w:left w:type="dxa" w:w="108"/>
+              <w:right w:type="dxa" w:w="108"/>
+            </w:tcMar>
           </w:tcPr>
           <w:p>
             <w:pPr>
@@ -3768,6 +4036,10 @@
               <w:bottom w:val="single" w:color="000000" w:sz="4"/>
               <w:right w:val="single" w:color="000000" w:sz="4"/>
             </w:tcBorders>
+            <w:tcMar>
+              <w:left w:type="dxa" w:w="108"/>
+              <w:right w:type="dxa" w:w="108"/>
+            </w:tcMar>
           </w:tcPr>
           <w:p>
             <w:pPr>
@@ -3791,6 +4063,10 @@
               <w:bottom w:val="single" w:color="000000" w:sz="4"/>
               <w:right w:val="single" w:color="000000" w:sz="4"/>
             </w:tcBorders>
+            <w:tcMar>
+              <w:left w:type="dxa" w:w="108"/>
+              <w:right w:type="dxa" w:w="108"/>
+            </w:tcMar>
           </w:tcPr>
           <w:p>
             <w:pPr>
@@ -3819,6 +4095,10 @@
               <w:bottom w:val="single" w:color="000000" w:sz="4"/>
               <w:right w:val="single" w:color="000000" w:sz="4"/>
             </w:tcBorders>
+            <w:tcMar>
+              <w:left w:type="dxa" w:w="108"/>
+              <w:right w:type="dxa" w:w="108"/>
+            </w:tcMar>
           </w:tcPr>
           <w:p>
             <w:pPr>
@@ -3843,6 +4123,10 @@
               <w:bottom w:val="single" w:color="000000" w:sz="4"/>
               <w:right w:val="single" w:color="000000" w:sz="4"/>
             </w:tcBorders>
+            <w:tcMar>
+              <w:left w:type="dxa" w:w="108"/>
+              <w:right w:type="dxa" w:w="108"/>
+            </w:tcMar>
           </w:tcPr>
           <w:p>
             <w:pPr>
@@ -3870,6 +4154,10 @@
               <w:bottom w:val="single" w:color="000000" w:sz="4"/>
               <w:right w:val="single" w:color="000000" w:sz="4"/>
             </w:tcBorders>
+            <w:tcMar>
+              <w:left w:type="dxa" w:w="108"/>
+              <w:right w:type="dxa" w:w="108"/>
+            </w:tcMar>
           </w:tcPr>
           <w:p>
             <w:pPr>
@@ -3899,6 +4187,10 @@
               <w:bottom w:val="single" w:color="000000" w:sz="4"/>
               <w:right w:val="single" w:color="000000" w:sz="4"/>
             </w:tcBorders>
+            <w:tcMar>
+              <w:left w:type="dxa" w:w="108"/>
+              <w:right w:type="dxa" w:w="108"/>
+            </w:tcMar>
           </w:tcPr>
           <w:p>
             <w:pPr>
@@ -3923,6 +4215,10 @@
               <w:bottom w:val="single" w:color="000000" w:sz="4"/>
               <w:right w:val="single" w:color="000000" w:sz="4"/>
             </w:tcBorders>
+            <w:tcMar>
+              <w:left w:type="dxa" w:w="108"/>
+              <w:right w:type="dxa" w:w="108"/>
+            </w:tcMar>
           </w:tcPr>
           <w:p>
             <w:pPr>
@@ -3942,6 +4238,10 @@
               <w:bottom w:val="single" w:color="000000" w:sz="4"/>
               <w:right w:val="single" w:color="000000" w:sz="4"/>
             </w:tcBorders>
+            <w:tcMar>
+              <w:left w:type="dxa" w:w="108"/>
+              <w:right w:type="dxa" w:w="108"/>
+            </w:tcMar>
           </w:tcPr>
           <w:p>
             <w:pPr>
@@ -3982,6 +4282,10 @@
               <w:bottom w:val="single" w:color="000000" w:sz="4"/>
               <w:right w:val="single" w:color="000000" w:sz="4"/>
             </w:tcBorders>
+            <w:tcMar>
+              <w:left w:type="dxa" w:w="108"/>
+              <w:right w:type="dxa" w:w="108"/>
+            </w:tcMar>
           </w:tcPr>
           <w:p>
             <w:pPr>
@@ -4006,6 +4310,10 @@
               <w:bottom w:val="single" w:color="000000" w:sz="4"/>
               <w:right w:val="single" w:color="000000" w:sz="4"/>
             </w:tcBorders>
+            <w:tcMar>
+              <w:left w:type="dxa" w:w="108"/>
+              <w:right w:type="dxa" w:w="108"/>
+            </w:tcMar>
           </w:tcPr>
           <w:p>
             <w:pPr>
@@ -4036,6 +4344,10 @@
               <w:bottom w:val="single" w:color="000000" w:sz="4"/>
               <w:right w:val="single" w:color="000000" w:sz="4"/>
             </w:tcBorders>
+            <w:tcMar>
+              <w:left w:type="dxa" w:w="108"/>
+              <w:right w:type="dxa" w:w="108"/>
+            </w:tcMar>
           </w:tcPr>
           <w:p>
             <w:pPr>
@@ -4065,6 +4377,10 @@
               <w:bottom w:val="single" w:color="000000" w:sz="4"/>
               <w:right w:val="single" w:color="000000" w:sz="4"/>
             </w:tcBorders>
+            <w:tcMar>
+              <w:left w:type="dxa" w:w="108"/>
+              <w:right w:type="dxa" w:w="108"/>
+            </w:tcMar>
           </w:tcPr>
           <w:p>
             <w:pPr>
@@ -4089,6 +4405,10 @@
               <w:bottom w:val="single" w:color="000000" w:sz="4"/>
               <w:right w:val="single" w:color="000000" w:sz="4"/>
             </w:tcBorders>
+            <w:tcMar>
+              <w:left w:type="dxa" w:w="108"/>
+              <w:right w:type="dxa" w:w="108"/>
+            </w:tcMar>
           </w:tcPr>
           <w:p>
             <w:pPr>
@@ -4108,6 +4428,10 @@
               <w:bottom w:val="single" w:color="000000" w:sz="4"/>
               <w:right w:val="single" w:color="000000" w:sz="4"/>
             </w:tcBorders>
+            <w:tcMar>
+              <w:left w:type="dxa" w:w="108"/>
+              <w:right w:type="dxa" w:w="108"/>
+            </w:tcMar>
           </w:tcPr>
           <w:p>
             <w:pPr>
@@ -4137,6 +4461,10 @@
               <w:bottom w:val="single" w:color="000000" w:sz="4"/>
               <w:right w:val="single" w:color="000000" w:sz="4"/>
             </w:tcBorders>
+            <w:tcMar>
+              <w:left w:type="dxa" w:w="108"/>
+              <w:right w:type="dxa" w:w="108"/>
+            </w:tcMar>
           </w:tcPr>
           <w:p>
             <w:pPr>
@@ -4161,6 +4489,10 @@
               <w:bottom w:val="single" w:color="000000" w:sz="4"/>
               <w:right w:val="single" w:color="000000" w:sz="4"/>
             </w:tcBorders>
+            <w:tcMar>
+              <w:left w:type="dxa" w:w="108"/>
+              <w:right w:type="dxa" w:w="108"/>
+            </w:tcMar>
           </w:tcPr>
           <w:p>
             <w:pPr>
@@ -4180,6 +4512,10 @@
               <w:bottom w:val="single" w:color="000000" w:sz="4"/>
               <w:right w:val="single" w:color="000000" w:sz="4"/>
             </w:tcBorders>
+            <w:tcMar>
+              <w:left w:type="dxa" w:w="108"/>
+              <w:right w:type="dxa" w:w="108"/>
+            </w:tcMar>
           </w:tcPr>
           <w:p>
             <w:pPr>
@@ -4209,6 +4545,10 @@
               <w:bottom w:val="single" w:color="000000" w:sz="4"/>
               <w:right w:val="single" w:color="000000" w:sz="4"/>
             </w:tcBorders>
+            <w:tcMar>
+              <w:left w:type="dxa" w:w="108"/>
+              <w:right w:type="dxa" w:w="108"/>
+            </w:tcMar>
           </w:tcPr>
           <w:p>
             <w:pPr>
@@ -4233,6 +4573,10 @@
               <w:bottom w:val="single" w:color="000000" w:sz="4"/>
               <w:right w:val="single" w:color="000000" w:sz="4"/>
             </w:tcBorders>
+            <w:tcMar>
+              <w:left w:type="dxa" w:w="108"/>
+              <w:right w:type="dxa" w:w="108"/>
+            </w:tcMar>
           </w:tcPr>
           <w:p>
             <w:pPr>
@@ -4252,6 +4596,10 @@
               <w:bottom w:val="single" w:color="000000" w:sz="4"/>
               <w:right w:val="single" w:color="000000" w:sz="4"/>
             </w:tcBorders>
+            <w:tcMar>
+              <w:left w:type="dxa" w:w="108"/>
+              <w:right w:type="dxa" w:w="108"/>
+            </w:tcMar>
           </w:tcPr>
           <w:p>
             <w:pPr>
@@ -4281,6 +4629,10 @@
               <w:bottom w:val="single" w:color="000000" w:sz="4"/>
               <w:right w:val="single" w:color="000000" w:sz="4"/>
             </w:tcBorders>
+            <w:tcMar>
+              <w:left w:type="dxa" w:w="108"/>
+              <w:right w:type="dxa" w:w="108"/>
+            </w:tcMar>
           </w:tcPr>
           <w:p>
             <w:pPr>
@@ -4305,6 +4657,10 @@
               <w:bottom w:val="single" w:color="000000" w:sz="4"/>
               <w:right w:val="single" w:color="000000" w:sz="4"/>
             </w:tcBorders>
+            <w:tcMar>
+              <w:left w:type="dxa" w:w="108"/>
+              <w:right w:type="dxa" w:w="108"/>
+            </w:tcMar>
           </w:tcPr>
           <w:p>
             <w:pPr>
@@ -4324,6 +4680,10 @@
               <w:bottom w:val="single" w:color="000000" w:sz="4"/>
               <w:right w:val="single" w:color="000000" w:sz="4"/>
             </w:tcBorders>
+            <w:tcMar>
+              <w:left w:type="dxa" w:w="108"/>
+              <w:right w:type="dxa" w:w="108"/>
+            </w:tcMar>
           </w:tcPr>
           <w:p>
             <w:pPr>
@@ -4353,6 +4713,10 @@
               <w:bottom w:val="single" w:color="000000" w:sz="4"/>
               <w:right w:val="single" w:color="000000" w:sz="4"/>
             </w:tcBorders>
+            <w:tcMar>
+              <w:left w:type="dxa" w:w="108"/>
+              <w:right w:type="dxa" w:w="108"/>
+            </w:tcMar>
           </w:tcPr>
           <w:p>
             <w:pPr>
@@ -4377,6 +4741,10 @@
               <w:bottom w:val="single" w:color="000000" w:sz="4"/>
               <w:right w:val="single" w:color="000000" w:sz="4"/>
             </w:tcBorders>
+            <w:tcMar>
+              <w:left w:type="dxa" w:w="108"/>
+              <w:right w:type="dxa" w:w="108"/>
+            </w:tcMar>
           </w:tcPr>
           <w:p>
             <w:pPr>
@@ -4396,6 +4764,10 @@
               <w:bottom w:val="single" w:color="000000" w:sz="4"/>
               <w:right w:val="single" w:color="000000" w:sz="4"/>
             </w:tcBorders>
+            <w:tcMar>
+              <w:left w:type="dxa" w:w="108"/>
+              <w:right w:type="dxa" w:w="108"/>
+            </w:tcMar>
           </w:tcPr>
           <w:p>
             <w:pPr>
@@ -4688,6 +5060,10 @@
               <w:bottom w:val="single" w:color="000000" w:sz="4"/>
               <w:right w:val="single" w:color="000000" w:sz="4"/>
             </w:tcBorders>
+            <w:tcMar>
+              <w:left w:type="dxa" w:w="108"/>
+              <w:right w:type="dxa" w:w="108"/>
+            </w:tcMar>
           </w:tcPr>
           <w:p>
             <w:pPr>
@@ -4711,6 +5087,10 @@
               <w:bottom w:val="single" w:color="000000" w:sz="4"/>
               <w:right w:val="single" w:color="000000" w:sz="4"/>
             </w:tcBorders>
+            <w:tcMar>
+              <w:left w:type="dxa" w:w="108"/>
+              <w:right w:type="dxa" w:w="108"/>
+            </w:tcMar>
           </w:tcPr>
           <w:p>
             <w:pPr>
@@ -4734,6 +5114,10 @@
               <w:bottom w:val="single" w:color="000000" w:sz="4"/>
               <w:right w:val="single" w:color="000000" w:sz="4"/>
             </w:tcBorders>
+            <w:tcMar>
+              <w:left w:type="dxa" w:w="108"/>
+              <w:right w:type="dxa" w:w="108"/>
+            </w:tcMar>
           </w:tcPr>
           <w:p>
             <w:pPr>
@@ -4762,6 +5146,10 @@
               <w:bottom w:val="single" w:color="000000" w:sz="4"/>
               <w:right w:val="single" w:color="000000" w:sz="4"/>
             </w:tcBorders>
+            <w:tcMar>
+              <w:left w:type="dxa" w:w="108"/>
+              <w:right w:type="dxa" w:w="108"/>
+            </w:tcMar>
           </w:tcPr>
           <w:p>
             <w:pPr>
@@ -4791,6 +5179,10 @@
               <w:bottom w:val="single" w:color="000000" w:sz="4"/>
               <w:right w:val="single" w:color="000000" w:sz="4"/>
             </w:tcBorders>
+            <w:tcMar>
+              <w:left w:type="dxa" w:w="108"/>
+              <w:right w:type="dxa" w:w="108"/>
+            </w:tcMar>
           </w:tcPr>
           <w:p>
             <w:pPr>
@@ -4810,6 +5202,10 @@
               <w:bottom w:val="single" w:color="000000" w:sz="4"/>
               <w:right w:val="single" w:color="000000" w:sz="4"/>
             </w:tcBorders>
+            <w:tcMar>
+              <w:left w:type="dxa" w:w="108"/>
+              <w:right w:type="dxa" w:w="108"/>
+            </w:tcMar>
           </w:tcPr>
           <w:p>
             <w:pPr>
@@ -4839,6 +5235,10 @@
               <w:bottom w:val="single" w:color="000000" w:sz="4"/>
               <w:right w:val="single" w:color="000000" w:sz="4"/>
             </w:tcBorders>
+            <w:tcMar>
+              <w:left w:type="dxa" w:w="108"/>
+              <w:right w:type="dxa" w:w="108"/>
+            </w:tcMar>
           </w:tcPr>
           <w:p>
             <w:pPr>
@@ -4865,6 +5265,10 @@
               <w:bottom w:val="single" w:color="000000" w:sz="4"/>
               <w:right w:val="single" w:color="000000" w:sz="4"/>
             </w:tcBorders>
+            <w:tcMar>
+              <w:left w:type="dxa" w:w="108"/>
+              <w:right w:type="dxa" w:w="108"/>
+            </w:tcMar>
           </w:tcPr>
           <w:p>
             <w:pPr>
@@ -4884,6 +5288,10 @@
               <w:bottom w:val="single" w:color="000000" w:sz="4"/>
               <w:right w:val="single" w:color="000000" w:sz="4"/>
             </w:tcBorders>
+            <w:tcMar>
+              <w:left w:type="dxa" w:w="108"/>
+              <w:right w:type="dxa" w:w="108"/>
+            </w:tcMar>
           </w:tcPr>
           <w:p>
             <w:pPr>
@@ -4913,6 +5321,10 @@
               <w:bottom w:val="single" w:color="000000" w:sz="4"/>
               <w:right w:val="single" w:color="000000" w:sz="4"/>
             </w:tcBorders>
+            <w:tcMar>
+              <w:left w:type="dxa" w:w="108"/>
+              <w:right w:type="dxa" w:w="108"/>
+            </w:tcMar>
           </w:tcPr>
           <w:p>
             <w:pPr>
@@ -4949,6 +5361,10 @@
               <w:bottom w:val="single" w:color="000000" w:sz="4"/>
               <w:right w:val="single" w:color="000000" w:sz="4"/>
             </w:tcBorders>
+            <w:tcMar>
+              <w:left w:type="dxa" w:w="108"/>
+              <w:right w:type="dxa" w:w="108"/>
+            </w:tcMar>
           </w:tcPr>
           <w:p>
             <w:pPr>
@@ -4968,6 +5384,10 @@
               <w:bottom w:val="single" w:color="000000" w:sz="4"/>
               <w:right w:val="single" w:color="000000" w:sz="4"/>
             </w:tcBorders>
+            <w:tcMar>
+              <w:left w:type="dxa" w:w="108"/>
+              <w:right w:type="dxa" w:w="108"/>
+            </w:tcMar>
           </w:tcPr>
           <w:p>
             <w:pPr>
@@ -5008,6 +5428,10 @@
               <w:bottom w:val="single" w:color="000000" w:sz="4"/>
               <w:right w:val="single" w:color="000000" w:sz="4"/>
             </w:tcBorders>
+            <w:tcMar>
+              <w:left w:type="dxa" w:w="108"/>
+              <w:right w:type="dxa" w:w="108"/>
+            </w:tcMar>
           </w:tcPr>
           <w:p>
             <w:pPr>
@@ -5034,6 +5458,10 @@
               <w:bottom w:val="single" w:color="000000" w:sz="4"/>
               <w:right w:val="single" w:color="000000" w:sz="4"/>
             </w:tcBorders>
+            <w:tcMar>
+              <w:left w:type="dxa" w:w="108"/>
+              <w:right w:type="dxa" w:w="108"/>
+            </w:tcMar>
           </w:tcPr>
           <w:p>
             <w:pPr>
@@ -5053,6 +5481,10 @@
               <w:bottom w:val="single" w:color="000000" w:sz="4"/>
               <w:right w:val="single" w:color="000000" w:sz="4"/>
             </w:tcBorders>
+            <w:tcMar>
+              <w:left w:type="dxa" w:w="108"/>
+              <w:right w:type="dxa" w:w="108"/>
+            </w:tcMar>
           </w:tcPr>
           <w:p>
             <w:pPr>
@@ -5082,6 +5514,10 @@
               <w:bottom w:val="single" w:color="000000" w:sz="4"/>
               <w:right w:val="single" w:color="000000" w:sz="4"/>
             </w:tcBorders>
+            <w:tcMar>
+              <w:left w:type="dxa" w:w="108"/>
+              <w:right w:type="dxa" w:w="108"/>
+            </w:tcMar>
           </w:tcPr>
           <w:p>
             <w:pPr>
@@ -5108,6 +5544,10 @@
               <w:bottom w:val="single" w:color="000000" w:sz="4"/>
               <w:right w:val="single" w:color="000000" w:sz="4"/>
             </w:tcBorders>
+            <w:tcMar>
+              <w:left w:type="dxa" w:w="108"/>
+              <w:right w:type="dxa" w:w="108"/>
+            </w:tcMar>
           </w:tcPr>
           <w:p>
             <w:pPr>
@@ -5127,6 +5567,10 @@
               <w:bottom w:val="single" w:color="000000" w:sz="4"/>
               <w:right w:val="single" w:color="000000" w:sz="4"/>
             </w:tcBorders>
+            <w:tcMar>
+              <w:left w:type="dxa" w:w="108"/>
+              <w:right w:type="dxa" w:w="108"/>
+            </w:tcMar>
           </w:tcPr>
           <w:p>
             <w:pPr>
@@ -5156,6 +5600,10 @@
               <w:bottom w:val="single" w:color="000000" w:sz="4"/>
               <w:right w:val="single" w:color="000000" w:sz="4"/>
             </w:tcBorders>
+            <w:tcMar>
+              <w:left w:type="dxa" w:w="108"/>
+              <w:right w:type="dxa" w:w="108"/>
+            </w:tcMar>
           </w:tcPr>
           <w:p>
             <w:pPr>
@@ -5182,6 +5630,10 @@
               <w:bottom w:val="single" w:color="000000" w:sz="4"/>
               <w:right w:val="single" w:color="000000" w:sz="4"/>
             </w:tcBorders>
+            <w:tcMar>
+              <w:left w:type="dxa" w:w="108"/>
+              <w:right w:type="dxa" w:w="108"/>
+            </w:tcMar>
           </w:tcPr>
           <w:p>
             <w:pPr>
@@ -5201,6 +5653,10 @@
               <w:bottom w:val="single" w:color="000000" w:sz="4"/>
               <w:right w:val="single" w:color="000000" w:sz="4"/>
             </w:tcBorders>
+            <w:tcMar>
+              <w:left w:type="dxa" w:w="108"/>
+              <w:right w:type="dxa" w:w="108"/>
+            </w:tcMar>
           </w:tcPr>
           <w:p>
             <w:pPr>
@@ -5230,6 +5686,10 @@
               <w:bottom w:val="single" w:color="000000" w:sz="4"/>
               <w:right w:val="single" w:color="000000" w:sz="4"/>
             </w:tcBorders>
+            <w:tcMar>
+              <w:left w:type="dxa" w:w="108"/>
+              <w:right w:type="dxa" w:w="108"/>
+            </w:tcMar>
           </w:tcPr>
           <w:p>
             <w:pPr>
@@ -5256,6 +5716,10 @@
               <w:bottom w:val="single" w:color="000000" w:sz="4"/>
               <w:right w:val="single" w:color="000000" w:sz="4"/>
             </w:tcBorders>
+            <w:tcMar>
+              <w:left w:type="dxa" w:w="108"/>
+              <w:right w:type="dxa" w:w="108"/>
+            </w:tcMar>
           </w:tcPr>
           <w:p>
             <w:pPr>
@@ -5275,6 +5739,10 @@
               <w:bottom w:val="single" w:color="000000" w:sz="4"/>
               <w:right w:val="single" w:color="000000" w:sz="4"/>
             </w:tcBorders>
+            <w:tcMar>
+              <w:left w:type="dxa" w:w="108"/>
+              <w:right w:type="dxa" w:w="108"/>
+            </w:tcMar>
           </w:tcPr>
           <w:p>
             <w:pPr>
@@ -6397,6 +6865,10 @@
               <w:bottom w:val="single" w:color="000000" w:sz="4"/>
               <w:right w:val="single" w:color="000000" w:sz="4"/>
             </w:tcBorders>
+            <w:tcMar>
+              <w:left w:type="dxa" w:w="108"/>
+              <w:right w:type="dxa" w:w="108"/>
+            </w:tcMar>
           </w:tcPr>
           <w:p>
             <w:pPr>
@@ -6420,6 +6892,10 @@
               <w:bottom w:val="single" w:color="000000" w:sz="4"/>
               <w:right w:val="single" w:color="000000" w:sz="4"/>
             </w:tcBorders>
+            <w:tcMar>
+              <w:left w:type="dxa" w:w="108"/>
+              <w:right w:type="dxa" w:w="108"/>
+            </w:tcMar>
           </w:tcPr>
           <w:p>
             <w:pPr>
@@ -6448,6 +6924,10 @@
               <w:bottom w:val="single" w:color="000000" w:sz="4"/>
               <w:right w:val="single" w:color="000000" w:sz="4"/>
             </w:tcBorders>
+            <w:tcMar>
+              <w:left w:type="dxa" w:w="108"/>
+              <w:right w:type="dxa" w:w="108"/>
+            </w:tcMar>
           </w:tcPr>
           <w:p>
             <w:pPr>
@@ -6475,6 +6955,10 @@
               <w:bottom w:val="single" w:color="000000" w:sz="4"/>
               <w:right w:val="single" w:color="000000" w:sz="4"/>
             </w:tcBorders>
+            <w:tcMar>
+              <w:left w:type="dxa" w:w="108"/>
+              <w:right w:type="dxa" w:w="108"/>
+            </w:tcMar>
           </w:tcPr>
           <w:p>
             <w:pPr>
@@ -6499,6 +6983,10 @@
               <w:bottom w:val="single" w:color="000000" w:sz="4"/>
               <w:right w:val="single" w:color="000000" w:sz="4"/>
             </w:tcBorders>
+            <w:tcMar>
+              <w:left w:type="dxa" w:w="108"/>
+              <w:right w:type="dxa" w:w="108"/>
+            </w:tcMar>
           </w:tcPr>
           <w:p>
             <w:pPr>
@@ -6518,6 +7006,10 @@
               <w:bottom w:val="single" w:color="000000" w:sz="4"/>
               <w:right w:val="single" w:color="000000" w:sz="4"/>
             </w:tcBorders>
+            <w:tcMar>
+              <w:left w:type="dxa" w:w="108"/>
+              <w:right w:type="dxa" w:w="108"/>
+            </w:tcMar>
           </w:tcPr>
           <w:p>
             <w:pPr>
@@ -6553,6 +7045,10 @@
               <w:bottom w:val="single" w:color="000000" w:sz="4"/>
               <w:right w:val="single" w:color="000000" w:sz="4"/>
             </w:tcBorders>
+            <w:tcMar>
+              <w:left w:type="dxa" w:w="108"/>
+              <w:right w:type="dxa" w:w="108"/>
+            </w:tcMar>
           </w:tcPr>
           <w:p>
             <w:pPr>
@@ -6580,6 +7076,10 @@
               <w:bottom w:val="single" w:color="000000" w:sz="4"/>
               <w:right w:val="single" w:color="000000" w:sz="4"/>
             </w:tcBorders>
+            <w:tcMar>
+              <w:left w:type="dxa" w:w="108"/>
+              <w:right w:type="dxa" w:w="108"/>
+            </w:tcMar>
           </w:tcPr>
           <w:p>
             <w:pPr>
@@ -6631,6 +7131,10 @@
               <w:bottom w:val="single" w:color="000000" w:sz="4"/>
               <w:right w:val="single" w:color="000000" w:sz="4"/>
             </w:tcBorders>
+            <w:tcMar>
+              <w:left w:type="dxa" w:w="108"/>
+              <w:right w:type="dxa" w:w="108"/>
+            </w:tcMar>
           </w:tcPr>
           <w:p>
             <w:pPr>
@@ -6654,6 +7158,10 @@
               <w:bottom w:val="single" w:color="000000" w:sz="4"/>
               <w:right w:val="single" w:color="000000" w:sz="4"/>
             </w:tcBorders>
+            <w:tcMar>
+              <w:left w:type="dxa" w:w="108"/>
+              <w:right w:type="dxa" w:w="108"/>
+            </w:tcMar>
           </w:tcPr>
           <w:p>
             <w:pPr>
@@ -6682,6 +7190,10 @@
               <w:bottom w:val="single" w:color="000000" w:sz="4"/>
               <w:right w:val="single" w:color="000000" w:sz="4"/>
             </w:tcBorders>
+            <w:tcMar>
+              <w:left w:type="dxa" w:w="108"/>
+              <w:right w:type="dxa" w:w="108"/>
+            </w:tcMar>
           </w:tcPr>
           <w:p>
             <w:pPr>
@@ -6701,6 +7213,10 @@
               <w:bottom w:val="single" w:color="000000" w:sz="4"/>
               <w:right w:val="single" w:color="000000" w:sz="4"/>
             </w:tcBorders>
+            <w:tcMar>
+              <w:left w:type="dxa" w:w="108"/>
+              <w:right w:type="dxa" w:w="108"/>
+            </w:tcMar>
           </w:tcPr>
           <w:p>
             <w:pPr>
@@ -6725,6 +7241,10 @@
               <w:bottom w:val="single" w:color="000000" w:sz="4"/>
               <w:right w:val="single" w:color="000000" w:sz="4"/>
             </w:tcBorders>
+            <w:tcMar>
+              <w:left w:type="dxa" w:w="108"/>
+              <w:right w:type="dxa" w:w="108"/>
+            </w:tcMar>
           </w:tcPr>
           <w:p>
             <w:pPr>
@@ -6752,6 +7272,10 @@
               <w:bottom w:val="single" w:color="000000" w:sz="4"/>
               <w:right w:val="single" w:color="000000" w:sz="4"/>
             </w:tcBorders>
+            <w:tcMar>
+              <w:left w:type="dxa" w:w="108"/>
+              <w:right w:type="dxa" w:w="108"/>
+            </w:tcMar>
           </w:tcPr>
           <w:p>
             <w:pPr>
@@ -6776,6 +7300,10 @@
               <w:bottom w:val="single" w:color="000000" w:sz="4"/>
               <w:right w:val="single" w:color="000000" w:sz="4"/>
             </w:tcBorders>
+            <w:tcMar>
+              <w:left w:type="dxa" w:w="108"/>
+              <w:right w:type="dxa" w:w="108"/>
+            </w:tcMar>
           </w:tcPr>
           <w:p>
             <w:pPr>
@@ -6795,6 +7323,10 @@
               <w:bottom w:val="single" w:color="000000" w:sz="4"/>
               <w:right w:val="single" w:color="000000" w:sz="4"/>
             </w:tcBorders>
+            <w:tcMar>
+              <w:left w:type="dxa" w:w="108"/>
+              <w:right w:type="dxa" w:w="108"/>
+            </w:tcMar>
           </w:tcPr>
           <w:p>
             <w:pPr>
@@ -6819,6 +7351,10 @@
               <w:bottom w:val="single" w:color="000000" w:sz="4"/>
               <w:right w:val="single" w:color="000000" w:sz="4"/>
             </w:tcBorders>
+            <w:tcMar>
+              <w:left w:type="dxa" w:w="108"/>
+              <w:right w:type="dxa" w:w="108"/>
+            </w:tcMar>
           </w:tcPr>
           <w:p>
             <w:pPr>
@@ -6838,6 +7374,10 @@
               <w:bottom w:val="single" w:color="000000" w:sz="4"/>
               <w:right w:val="single" w:color="000000" w:sz="4"/>
             </w:tcBorders>
+            <w:tcMar>
+              <w:left w:type="dxa" w:w="108"/>
+              <w:right w:type="dxa" w:w="108"/>
+            </w:tcMar>
           </w:tcPr>
           <w:p>
             <w:pPr>
@@ -6884,6 +7424,10 @@
               <w:bottom w:val="single" w:color="000000" w:sz="4"/>
               <w:right w:val="single" w:color="000000" w:sz="4"/>
             </w:tcBorders>
+            <w:tcMar>
+              <w:left w:type="dxa" w:w="108"/>
+              <w:right w:type="dxa" w:w="108"/>
+            </w:tcMar>
           </w:tcPr>
           <w:p>
             <w:pPr>
@@ -6903,6 +7447,10 @@
               <w:bottom w:val="single" w:color="000000" w:sz="4"/>
               <w:right w:val="single" w:color="000000" w:sz="4"/>
             </w:tcBorders>
+            <w:tcMar>
+              <w:left w:type="dxa" w:w="108"/>
+              <w:right w:type="dxa" w:w="108"/>
+            </w:tcMar>
           </w:tcPr>
           <w:p>
             <w:pPr>
@@ -6938,6 +7486,10 @@
               <w:bottom w:val="single" w:color="000000" w:sz="4"/>
               <w:right w:val="single" w:color="000000" w:sz="4"/>
             </w:tcBorders>
+            <w:tcMar>
+              <w:left w:type="dxa" w:w="108"/>
+              <w:right w:type="dxa" w:w="108"/>
+            </w:tcMar>
           </w:tcPr>
           <w:p>
             <w:pPr>
@@ -6957,6 +7509,10 @@
               <w:bottom w:val="single" w:color="000000" w:sz="4"/>
               <w:right w:val="single" w:color="000000" w:sz="4"/>
             </w:tcBorders>
+            <w:tcMar>
+              <w:left w:type="dxa" w:w="108"/>
+              <w:right w:type="dxa" w:w="108"/>
+            </w:tcMar>
           </w:tcPr>
           <w:p>
             <w:pPr>
@@ -6992,6 +7548,10 @@
               <w:bottom w:val="single" w:color="000000" w:sz="4"/>
               <w:right w:val="single" w:color="000000" w:sz="4"/>
             </w:tcBorders>
+            <w:tcMar>
+              <w:left w:type="dxa" w:w="108"/>
+              <w:right w:type="dxa" w:w="108"/>
+            </w:tcMar>
           </w:tcPr>
           <w:p>
             <w:pPr>
@@ -7011,6 +7571,10 @@
               <w:bottom w:val="single" w:color="000000" w:sz="4"/>
               <w:right w:val="single" w:color="000000" w:sz="4"/>
             </w:tcBorders>
+            <w:tcMar>
+              <w:left w:type="dxa" w:w="108"/>
+              <w:right w:type="dxa" w:w="108"/>
+            </w:tcMar>
           </w:tcPr>
           <w:p>
             <w:pPr>
@@ -7046,6 +7610,10 @@
               <w:bottom w:val="single" w:color="000000" w:sz="4"/>
               <w:right w:val="single" w:color="000000" w:sz="4"/>
             </w:tcBorders>
+            <w:tcMar>
+              <w:left w:type="dxa" w:w="108"/>
+              <w:right w:type="dxa" w:w="108"/>
+            </w:tcMar>
           </w:tcPr>
           <w:p>
             <w:pPr>
@@ -7065,6 +7633,10 @@
               <w:bottom w:val="single" w:color="000000" w:sz="4"/>
               <w:right w:val="single" w:color="000000" w:sz="4"/>
             </w:tcBorders>
+            <w:tcMar>
+              <w:left w:type="dxa" w:w="108"/>
+              <w:right w:type="dxa" w:w="108"/>
+            </w:tcMar>
           </w:tcPr>
           <w:p>
             <w:pPr>
@@ -7122,6 +7694,10 @@
               <w:bottom w:val="single" w:color="000000" w:sz="4"/>
               <w:right w:val="single" w:color="000000" w:sz="4"/>
             </w:tcBorders>
+            <w:tcMar>
+              <w:left w:type="dxa" w:w="108"/>
+              <w:right w:type="dxa" w:w="108"/>
+            </w:tcMar>
           </w:tcPr>
           <w:p>
             <w:pPr>
@@ -7141,6 +7717,10 @@
               <w:bottom w:val="single" w:color="000000" w:sz="4"/>
               <w:right w:val="single" w:color="000000" w:sz="4"/>
             </w:tcBorders>
+            <w:tcMar>
+              <w:left w:type="dxa" w:w="108"/>
+              <w:right w:type="dxa" w:w="108"/>
+            </w:tcMar>
           </w:tcPr>
           <w:p>
             <w:pPr>
@@ -7165,6 +7745,10 @@
               <w:bottom w:val="single" w:color="000000" w:sz="4"/>
               <w:right w:val="single" w:color="000000" w:sz="4"/>
             </w:tcBorders>
+            <w:tcMar>
+              <w:left w:type="dxa" w:w="108"/>
+              <w:right w:type="dxa" w:w="108"/>
+            </w:tcMar>
           </w:tcPr>
           <w:p>
             <w:pPr>
@@ -7184,6 +7768,10 @@
               <w:bottom w:val="single" w:color="000000" w:sz="4"/>
               <w:right w:val="single" w:color="000000" w:sz="4"/>
             </w:tcBorders>
+            <w:tcMar>
+              <w:left w:type="dxa" w:w="108"/>
+              <w:right w:type="dxa" w:w="108"/>
+            </w:tcMar>
           </w:tcPr>
           <w:p>
             <w:pPr>
@@ -7219,6 +7807,10 @@
               <w:bottom w:val="single" w:color="000000" w:sz="4"/>
               <w:right w:val="single" w:color="000000" w:sz="4"/>
             </w:tcBorders>
+            <w:tcMar>
+              <w:left w:type="dxa" w:w="108"/>
+              <w:right w:type="dxa" w:w="108"/>
+            </w:tcMar>
           </w:tcPr>
           <w:p>
             <w:pPr>
@@ -7238,6 +7830,10 @@
               <w:bottom w:val="single" w:color="000000" w:sz="4"/>
               <w:right w:val="single" w:color="000000" w:sz="4"/>
             </w:tcBorders>
+            <w:tcMar>
+              <w:left w:type="dxa" w:w="108"/>
+              <w:right w:type="dxa" w:w="108"/>
+            </w:tcMar>
           </w:tcPr>
           <w:p>
             <w:pPr>
@@ -7262,6 +7858,10 @@
               <w:bottom w:val="single" w:color="000000" w:sz="4"/>
               <w:right w:val="single" w:color="000000" w:sz="4"/>
             </w:tcBorders>
+            <w:tcMar>
+              <w:left w:type="dxa" w:w="108"/>
+              <w:right w:type="dxa" w:w="108"/>
+            </w:tcMar>
           </w:tcPr>
           <w:p>
             <w:pPr>
@@ -7281,6 +7881,10 @@
               <w:bottom w:val="single" w:color="000000" w:sz="4"/>
               <w:right w:val="single" w:color="000000" w:sz="4"/>
             </w:tcBorders>
+            <w:tcMar>
+              <w:left w:type="dxa" w:w="108"/>
+              <w:right w:type="dxa" w:w="108"/>
+            </w:tcMar>
           </w:tcPr>
           <w:p>
             <w:pPr>
@@ -7343,6 +7947,10 @@
               <w:bottom w:val="single" w:color="000000" w:sz="4"/>
               <w:right w:val="single" w:color="000000" w:sz="4"/>
             </w:tcBorders>
+            <w:tcMar>
+              <w:left w:type="dxa" w:w="108"/>
+              <w:right w:type="dxa" w:w="108"/>
+            </w:tcMar>
           </w:tcPr>
           <w:p>
             <w:pPr>
@@ -7366,6 +7974,10 @@
               <w:bottom w:val="single" w:color="000000" w:sz="4"/>
               <w:right w:val="single" w:color="000000" w:sz="4"/>
             </w:tcBorders>
+            <w:tcMar>
+              <w:left w:type="dxa" w:w="108"/>
+              <w:right w:type="dxa" w:w="108"/>
+            </w:tcMar>
           </w:tcPr>
           <w:p>
             <w:pPr>
@@ -7394,6 +8006,10 @@
               <w:bottom w:val="single" w:color="000000" w:sz="4"/>
               <w:right w:val="single" w:color="000000" w:sz="4"/>
             </w:tcBorders>
+            <w:tcMar>
+              <w:left w:type="dxa" w:w="108"/>
+              <w:right w:type="dxa" w:w="108"/>
+            </w:tcMar>
           </w:tcPr>
           <w:p>
             <w:pPr>
@@ -7421,6 +8037,10 @@
               <w:bottom w:val="single" w:color="000000" w:sz="4"/>
               <w:right w:val="single" w:color="000000" w:sz="4"/>
             </w:tcBorders>
+            <w:tcMar>
+              <w:left w:type="dxa" w:w="108"/>
+              <w:right w:type="dxa" w:w="108"/>
+            </w:tcMar>
           </w:tcPr>
           <w:p>
             <w:pPr>
@@ -7445,6 +8065,10 @@
               <w:bottom w:val="single" w:color="000000" w:sz="4"/>
               <w:right w:val="single" w:color="000000" w:sz="4"/>
             </w:tcBorders>
+            <w:tcMar>
+              <w:left w:type="dxa" w:w="108"/>
+              <w:right w:type="dxa" w:w="108"/>
+            </w:tcMar>
           </w:tcPr>
           <w:p>
             <w:pPr>
@@ -7464,6 +8088,10 @@
               <w:bottom w:val="single" w:color="000000" w:sz="4"/>
               <w:right w:val="single" w:color="000000" w:sz="4"/>
             </w:tcBorders>
+            <w:tcMar>
+              <w:left w:type="dxa" w:w="108"/>
+              <w:right w:type="dxa" w:w="108"/>
+            </w:tcMar>
           </w:tcPr>
           <w:p>
             <w:pPr>
@@ -7488,6 +8116,10 @@
               <w:bottom w:val="single" w:color="000000" w:sz="4"/>
               <w:right w:val="single" w:color="000000" w:sz="4"/>
             </w:tcBorders>
+            <w:tcMar>
+              <w:left w:type="dxa" w:w="108"/>
+              <w:right w:type="dxa" w:w="108"/>
+            </w:tcMar>
           </w:tcPr>
           <w:p>
             <w:pPr>
@@ -7518,6 +8150,10 @@
               <w:bottom w:val="single" w:color="000000" w:sz="4"/>
               <w:right w:val="single" w:color="000000" w:sz="4"/>
             </w:tcBorders>
+            <w:tcMar>
+              <w:left w:type="dxa" w:w="108"/>
+              <w:right w:type="dxa" w:w="108"/>
+            </w:tcMar>
           </w:tcPr>
           <w:p>
             <w:pPr>
@@ -7576,6 +8212,10 @@
               <w:bottom w:val="single" w:color="000000" w:sz="4"/>
               <w:right w:val="single" w:color="000000" w:sz="4"/>
             </w:tcBorders>
+            <w:tcMar>
+              <w:left w:type="dxa" w:w="108"/>
+              <w:right w:type="dxa" w:w="108"/>
+            </w:tcMar>
           </w:tcPr>
           <w:p>
             <w:pPr>
@@ -7599,6 +8239,10 @@
               <w:bottom w:val="single" w:color="000000" w:sz="4"/>
               <w:right w:val="single" w:color="000000" w:sz="4"/>
             </w:tcBorders>
+            <w:tcMar>
+              <w:left w:type="dxa" w:w="108"/>
+              <w:right w:type="dxa" w:w="108"/>
+            </w:tcMar>
           </w:tcPr>
           <w:p>
             <w:pPr>
@@ -7622,6 +8266,10 @@
               <w:bottom w:val="single" w:color="000000" w:sz="4"/>
               <w:right w:val="single" w:color="000000" w:sz="4"/>
             </w:tcBorders>
+            <w:tcMar>
+              <w:left w:type="dxa" w:w="108"/>
+              <w:right w:type="dxa" w:w="108"/>
+            </w:tcMar>
           </w:tcPr>
           <w:p>
             <w:pPr>
@@ -7650,6 +8298,10 @@
               <w:bottom w:val="single" w:color="000000" w:sz="4"/>
               <w:right w:val="single" w:color="000000" w:sz="4"/>
             </w:tcBorders>
+            <w:tcMar>
+              <w:left w:type="dxa" w:w="108"/>
+              <w:right w:type="dxa" w:w="108"/>
+            </w:tcMar>
           </w:tcPr>
           <w:p>
             <w:pPr>
@@ -7669,6 +8321,10 @@
               <w:bottom w:val="single" w:color="000000" w:sz="4"/>
               <w:right w:val="single" w:color="000000" w:sz="4"/>
             </w:tcBorders>
+            <w:tcMar>
+              <w:left w:type="dxa" w:w="108"/>
+              <w:right w:type="dxa" w:w="108"/>
+            </w:tcMar>
           </w:tcPr>
           <w:p>
             <w:pPr>
@@ -7688,6 +8344,10 @@
               <w:bottom w:val="single" w:color="000000" w:sz="4"/>
               <w:right w:val="single" w:color="000000" w:sz="4"/>
             </w:tcBorders>
+            <w:tcMar>
+              <w:left w:type="dxa" w:w="108"/>
+              <w:right w:type="dxa" w:w="108"/>
+            </w:tcMar>
           </w:tcPr>
           <w:p>
             <w:pPr>
@@ -7723,6 +8383,10 @@
               <w:bottom w:val="single" w:color="000000" w:sz="4"/>
               <w:right w:val="single" w:color="000000" w:sz="4"/>
             </w:tcBorders>
+            <w:tcMar>
+              <w:left w:type="dxa" w:w="108"/>
+              <w:right w:type="dxa" w:w="108"/>
+            </w:tcMar>
           </w:tcPr>
           <w:p>
             <w:pPr>
@@ -7742,6 +8406,10 @@
               <w:bottom w:val="single" w:color="000000" w:sz="4"/>
               <w:right w:val="single" w:color="000000" w:sz="4"/>
             </w:tcBorders>
+            <w:tcMar>
+              <w:left w:type="dxa" w:w="108"/>
+              <w:right w:type="dxa" w:w="108"/>
+            </w:tcMar>
           </w:tcPr>
           <w:p>
             <w:pPr>
@@ -7761,6 +8429,10 @@
               <w:bottom w:val="single" w:color="000000" w:sz="4"/>
               <w:right w:val="single" w:color="000000" w:sz="4"/>
             </w:tcBorders>
+            <w:tcMar>
+              <w:left w:type="dxa" w:w="108"/>
+              <w:right w:type="dxa" w:w="108"/>
+            </w:tcMar>
           </w:tcPr>
           <w:p>
             <w:pPr>
@@ -7851,6 +8523,10 @@
               <w:bottom w:val="single" w:color="000000" w:sz="4"/>
               <w:right w:val="single" w:color="000000" w:sz="4"/>
             </w:tcBorders>
+            <w:tcMar>
+              <w:left w:type="dxa" w:w="108"/>
+              <w:right w:type="dxa" w:w="108"/>
+            </w:tcMar>
           </w:tcPr>
           <w:p>
             <w:pPr>
@@ -7870,6 +8546,10 @@
               <w:bottom w:val="single" w:color="000000" w:sz="4"/>
               <w:right w:val="single" w:color="000000" w:sz="4"/>
             </w:tcBorders>
+            <w:tcMar>
+              <w:left w:type="dxa" w:w="108"/>
+              <w:right w:type="dxa" w:w="108"/>
+            </w:tcMar>
           </w:tcPr>
           <w:p>
             <w:pPr>
@@ -7889,6 +8569,10 @@
               <w:bottom w:val="single" w:color="000000" w:sz="4"/>
               <w:right w:val="single" w:color="000000" w:sz="4"/>
             </w:tcBorders>
+            <w:tcMar>
+              <w:left w:type="dxa" w:w="108"/>
+              <w:right w:type="dxa" w:w="108"/>
+            </w:tcMar>
           </w:tcPr>
           <w:p>
             <w:pPr>
@@ -7913,6 +8597,10 @@
               <w:bottom w:val="single" w:color="000000" w:sz="4"/>
               <w:right w:val="single" w:color="000000" w:sz="4"/>
             </w:tcBorders>
+            <w:tcMar>
+              <w:left w:type="dxa" w:w="108"/>
+              <w:right w:type="dxa" w:w="108"/>
+            </w:tcMar>
           </w:tcPr>
           <w:p>
             <w:pPr>
@@ -7932,6 +8620,10 @@
               <w:bottom w:val="single" w:color="000000" w:sz="4"/>
               <w:right w:val="single" w:color="000000" w:sz="4"/>
             </w:tcBorders>
+            <w:tcMar>
+              <w:left w:type="dxa" w:w="108"/>
+              <w:right w:type="dxa" w:w="108"/>
+            </w:tcMar>
           </w:tcPr>
           <w:p>
             <w:pPr>
@@ -7951,6 +8643,10 @@
               <w:bottom w:val="single" w:color="000000" w:sz="4"/>
               <w:right w:val="single" w:color="000000" w:sz="4"/>
             </w:tcBorders>
+            <w:tcMar>
+              <w:left w:type="dxa" w:w="108"/>
+              <w:right w:type="dxa" w:w="108"/>
+            </w:tcMar>
           </w:tcPr>
           <w:p>
             <w:pPr>
@@ -8063,6 +8759,10 @@
               <w:bottom w:val="single" w:color="000000" w:sz="4"/>
               <w:right w:val="single" w:color="000000" w:sz="4"/>
             </w:tcBorders>
+            <w:tcMar>
+              <w:left w:type="dxa" w:w="108"/>
+              <w:right w:type="dxa" w:w="108"/>
+            </w:tcMar>
           </w:tcPr>
           <w:p>
             <w:pPr>
@@ -8082,6 +8782,10 @@
               <w:bottom w:val="single" w:color="000000" w:sz="4"/>
               <w:right w:val="single" w:color="000000" w:sz="4"/>
             </w:tcBorders>
+            <w:tcMar>
+              <w:left w:type="dxa" w:w="108"/>
+              <w:right w:type="dxa" w:w="108"/>
+            </w:tcMar>
           </w:tcPr>
           <w:p>
             <w:pPr>
@@ -8101,6 +8805,10 @@
               <w:bottom w:val="single" w:color="000000" w:sz="4"/>
               <w:right w:val="single" w:color="000000" w:sz="4"/>
             </w:tcBorders>
+            <w:tcMar>
+              <w:left w:type="dxa" w:w="108"/>
+              <w:right w:type="dxa" w:w="108"/>
+            </w:tcMar>
           </w:tcPr>
           <w:p>
             <w:pPr>
@@ -8152,6 +8860,10 @@
               <w:bottom w:val="single" w:color="000000" w:sz="4"/>
               <w:right w:val="single" w:color="000000" w:sz="4"/>
             </w:tcBorders>
+            <w:tcMar>
+              <w:left w:type="dxa" w:w="108"/>
+              <w:right w:type="dxa" w:w="108"/>
+            </w:tcMar>
           </w:tcPr>
           <w:p>
             <w:pPr>
@@ -8175,6 +8887,10 @@
               <w:bottom w:val="single" w:color="000000" w:sz="4"/>
               <w:right w:val="single" w:color="000000" w:sz="4"/>
             </w:tcBorders>
+            <w:tcMar>
+              <w:left w:type="dxa" w:w="108"/>
+              <w:right w:type="dxa" w:w="108"/>
+            </w:tcMar>
           </w:tcPr>
           <w:p>
             <w:pPr>
@@ -8203,6 +8919,10 @@
               <w:bottom w:val="single" w:color="000000" w:sz="4"/>
               <w:right w:val="single" w:color="000000" w:sz="4"/>
             </w:tcBorders>
+            <w:tcMar>
+              <w:left w:type="dxa" w:w="108"/>
+              <w:right w:type="dxa" w:w="108"/>
+            </w:tcMar>
           </w:tcPr>
           <w:p>
             <w:pPr>
@@ -8229,6 +8949,10 @@
               <w:bottom w:val="single" w:color="000000" w:sz="4"/>
               <w:right w:val="single" w:color="000000" w:sz="4"/>
             </w:tcBorders>
+            <w:tcMar>
+              <w:left w:type="dxa" w:w="108"/>
+              <w:right w:type="dxa" w:w="108"/>
+            </w:tcMar>
           </w:tcPr>
           <w:p>
             <w:pPr>
@@ -8261,6 +8985,10 @@
               <w:bottom w:val="single" w:color="000000" w:sz="4"/>
               <w:right w:val="single" w:color="000000" w:sz="4"/>
             </w:tcBorders>
+            <w:tcMar>
+              <w:left w:type="dxa" w:w="108"/>
+              <w:right w:type="dxa" w:w="108"/>
+            </w:tcMar>
           </w:tcPr>
           <w:p>
             <w:pPr>
@@ -8295,6 +9023,10 @@
               <w:bottom w:val="single" w:color="000000" w:sz="4"/>
               <w:right w:val="single" w:color="000000" w:sz="4"/>
             </w:tcBorders>
+            <w:tcMar>
+              <w:left w:type="dxa" w:w="108"/>
+              <w:right w:type="dxa" w:w="108"/>
+            </w:tcMar>
           </w:tcPr>
           <w:p>
             <w:pPr>
@@ -8327,6 +9059,10 @@
               <w:bottom w:val="single" w:color="000000" w:sz="4"/>
               <w:right w:val="single" w:color="000000" w:sz="4"/>
             </w:tcBorders>
+            <w:tcMar>
+              <w:left w:type="dxa" w:w="108"/>
+              <w:right w:type="dxa" w:w="108"/>
+            </w:tcMar>
           </w:tcPr>
           <w:p>
             <w:pPr>
@@ -8353,6 +9089,10 @@
               <w:bottom w:val="single" w:color="000000" w:sz="4"/>
               <w:right w:val="single" w:color="000000" w:sz="4"/>
             </w:tcBorders>
+            <w:tcMar>
+              <w:left w:type="dxa" w:w="108"/>
+              <w:right w:type="dxa" w:w="108"/>
+            </w:tcMar>
           </w:tcPr>
           <w:p>
             <w:pPr>
@@ -8385,6 +9125,10 @@
               <w:bottom w:val="single" w:color="000000" w:sz="4"/>
               <w:right w:val="single" w:color="000000" w:sz="4"/>
             </w:tcBorders>
+            <w:tcMar>
+              <w:left w:type="dxa" w:w="108"/>
+              <w:right w:type="dxa" w:w="108"/>
+            </w:tcMar>
           </w:tcPr>
           <w:p>
             <w:pPr>
@@ -8422,6 +9166,10 @@
               <w:bottom w:val="single" w:color="000000" w:sz="4"/>
               <w:right w:val="single" w:color="000000" w:sz="4"/>
             </w:tcBorders>
+            <w:tcMar>
+              <w:left w:type="dxa" w:w="108"/>
+              <w:right w:type="dxa" w:w="108"/>
+            </w:tcMar>
           </w:tcPr>
           <w:p>
             <w:pPr>
@@ -8454,6 +9202,10 @@
               <w:bottom w:val="single" w:color="000000" w:sz="4"/>
               <w:right w:val="single" w:color="000000" w:sz="4"/>
             </w:tcBorders>
+            <w:tcMar>
+              <w:left w:type="dxa" w:w="108"/>
+              <w:right w:type="dxa" w:w="108"/>
+            </w:tcMar>
           </w:tcPr>
           <w:p>
             <w:pPr>
@@ -8491,6 +9243,10 @@
               <w:bottom w:val="single" w:color="000000" w:sz="4"/>
               <w:right w:val="single" w:color="000000" w:sz="4"/>
             </w:tcBorders>
+            <w:tcMar>
+              <w:left w:type="dxa" w:w="108"/>
+              <w:right w:type="dxa" w:w="108"/>
+            </w:tcMar>
           </w:tcPr>
           <w:p>
             <w:pPr>
@@ -8515,6 +9271,10 @@
               <w:bottom w:val="single" w:color="000000" w:sz="4"/>
               <w:right w:val="single" w:color="000000" w:sz="4"/>
             </w:tcBorders>
+            <w:tcMar>
+              <w:left w:type="dxa" w:w="108"/>
+              <w:right w:type="dxa" w:w="108"/>
+            </w:tcMar>
           </w:tcPr>
           <w:p>
             <w:pPr>
@@ -8541,6 +9301,10 @@
               <w:bottom w:val="single" w:color="000000" w:sz="4"/>
               <w:right w:val="single" w:color="000000" w:sz="4"/>
             </w:tcBorders>
+            <w:tcMar>
+              <w:left w:type="dxa" w:w="108"/>
+              <w:right w:type="dxa" w:w="108"/>
+            </w:tcMar>
           </w:tcPr>
           <w:p>
             <w:pPr>

</xml_diff>